<commit_message>
seed(revisao): redline by whole words (from Quill, #12 2f4142ff)
'30 (trinta)' -> '60 (sessenta)' instead of word fragments; the revised .docx
and the edits' w:ids follow. The originals did not change.

Co-Authored-By: Claude Opus 5.5 (1M context) <noreply@anthropic.com>
</commit_message>
<xml_diff>
--- a/deploy/gke/seed/integration/files/seed/revisao/datavale-revisado.docx
+++ b/deploy/gke/seed/integration/files/seed/revisao/datavale-revisado.docx
@@ -38,21 +38,18 @@
     </w:p>
     <w:p>
       <w:r>
-        <w:t xml:space="preserve">6.1 A alteração do controle societário d</w:t>
-      </w:r>
-      <w:ins w:id="2" w:author="Agente de revisão" w:date="2026-10-21T01:36:16.314Z">
+        <w:t xml:space="preserve">6.1 A alteração do controle societário </w:t>
+      </w:r>
+      <w:ins w:id="2" w:author="Agente de revisão" w:date="2026-10-21T18:22:09.866Z">
         <w:r>
-          <w:t xml:space="preserve">e qualquer das Partes será comunicada à outra em até 30 (trinta) dias, não constituindo hipótese de rescisão. 'Controle' significa a titularidade da maioria do capital votante</w:t>
+          <w:t xml:space="preserve">de qualquer das Partes será comunicada à outra em até 30 (trinta) dias, não constituindo hipótese de rescisão. 'Controle' significa a titularidade da maioria do capital votante.</w:t>
         </w:r>
       </w:ins>
-      <w:del w:id="1" w:author="Agente de revisão" w:date="2026-10-21T01:36:16.314Z">
+      <w:del w:id="1" w:author="Agente de revisão" w:date="2026-10-21T18:22:09.866Z">
         <w:r>
-          <w:delText xml:space="preserve">a Avenia dependerá de anuência prévia da CONTRATADA, sob pena de rescisão</w:delText>
+          <w:delText xml:space="preserve">da Avenia dependerá de anuência prévia da CONTRATADA, sob pena de rescisão.</w:delText>
         </w:r>
       </w:del>
-      <w:r>
-        <w:t xml:space="preserve">.</w:t>
-      </w:r>
     </w:p>
     <w:p>
       <w:pPr>
@@ -64,16 +61,18 @@
     </w:p>
     <w:p>
       <w:r>
-        <w:t xml:space="preserve">8.1 A CONTRATADA poderá armazenar os dados em servidores localizados fora do Brasil</w:t>
-      </w:r>
-      <w:ins w:id="3" w:author="Agente de revisão" w:date="2026-10-21T01:36:16.314Z">
+        <w:t xml:space="preserve">8.1 A CONTRATADA poderá armazenar os dados em servidores localizados fora do </w:t>
+      </w:r>
+      <w:ins w:id="4" w:author="Agente de revisão" w:date="2026-10-21T18:22:09.866Z">
         <w:r>
-          <w:t xml:space="preserve">, desde que adote as cláusulas-padrão contratuais aprovadas pela ANPD</w:t>
+          <w:t xml:space="preserve">Brasil, desde que adote as cláusulas-padrão contratuais aprovadas pela ANPD.</w:t>
         </w:r>
       </w:ins>
-      <w:r>
-        <w:t xml:space="preserve">.</w:t>
-      </w:r>
+      <w:del w:id="3" w:author="Agente de revisão" w:date="2026-10-21T18:22:09.866Z">
+        <w:r>
+          <w:delText xml:space="preserve">Brasil.</w:delText>
+        </w:r>
+      </w:del>
     </w:p>
     <w:p>
       <w:pPr>
@@ -87,12 +86,12 @@
       <w:r>
         <w:t xml:space="preserve">10.1 As Partes manterão sigilo sobre as informações recebidas </w:t>
       </w:r>
-      <w:ins w:id="5" w:author="Agente de revisão" w:date="2026-10-21T01:36:16.314Z">
+      <w:ins w:id="6" w:author="Agente de revisão" w:date="2026-10-21T18:22:09.866Z">
         <w:r>
           <w:t xml:space="preserve">ressalvada a divulgação exigida por lei, regulador ou ordem judicial, que independe de aviso à outra Parte quando a lei ou a autoridade o vedar</w:t>
         </w:r>
       </w:ins>
-      <w:del w:id="4" w:author="Agente de revisão" w:date="2026-10-21T01:36:16.314Z">
+      <w:del w:id="5" w:author="Agente de revisão" w:date="2026-10-21T18:22:09.866Z">
         <w:r>
           <w:delText xml:space="preserve">e somente as revelarão a autoridades mediante aviso prévio à outra Parte</w:delText>
         </w:r>
@@ -113,12 +112,12 @@
       <w:r>
         <w:t xml:space="preserve">12.1 Em caso de rescisão antecipada pela Avenia, será devida multa de </w:t>
       </w:r>
-      <w:ins w:id="7" w:author="Agente de revisão" w:date="2026-10-21T01:36:16.314Z">
+      <w:ins w:id="8" w:author="Agente de revisão" w:date="2026-10-21T18:22:09.866Z">
         <w:r>
           <w:t xml:space="preserve">20% (vinte por cento) sobre o saldo remanescente</w:t>
         </w:r>
       </w:ins>
-      <w:del w:id="6" w:author="Agente de revisão" w:date="2026-10-21T01:36:16.314Z">
+      <w:del w:id="7" w:author="Agente de revisão" w:date="2026-10-21T18:22:09.866Z">
         <w:r>
           <w:delText xml:space="preserve">50% (cinquenta por cento) do valor total</w:delText>
         </w:r>

</xml_diff>